<commit_message>
feat: integrate Basil Valley menu, fix dietary classification & filters, sync InfinityFree deployment
</commit_message>
<xml_diff>
--- a/Documentation/Final/First 4 pages.docx
+++ b/Documentation/Final/First 4 pages.docx
@@ -19,16 +19,16 @@
           <w14:ligatures w14:val="standardContextual"/>
         </w:rPr>
         <w:drawing>
-          <wp:anchor distT="0" distB="0" distL="114300" distR="114300" simplePos="0" relativeHeight="251661312" behindDoc="0" locked="0" layoutInCell="1" allowOverlap="1" wp14:anchorId="40CAC417" wp14:editId="49E94276">
+          <wp:anchor distT="0" distB="0" distL="114300" distR="114300" simplePos="0" relativeHeight="251661312" behindDoc="0" locked="0" layoutInCell="1" allowOverlap="1" wp14:anchorId="40CAC417" wp14:editId="4F4920B9">
             <wp:simplePos x="0" y="0"/>
             <wp:positionH relativeFrom="page">
               <wp:align>left</wp:align>
             </wp:positionH>
             <wp:positionV relativeFrom="paragraph">
-              <wp:posOffset>-913130</wp:posOffset>
+              <wp:posOffset>-930275</wp:posOffset>
             </wp:positionV>
-            <wp:extent cx="7577667" cy="10675913"/>
-            <wp:effectExtent l="0" t="0" r="4445" b="0"/>
+            <wp:extent cx="7556500" cy="10702925"/>
+            <wp:effectExtent l="0" t="0" r="6350" b="3175"/>
             <wp:wrapNone/>
             <wp:docPr id="769803136" name="Graphic 1"/>
             <wp:cNvGraphicFramePr>
@@ -38,14 +38,14 @@
               <a:graphicData uri="http://schemas.openxmlformats.org/drawingml/2006/picture">
                 <pic:pic xmlns:pic="http://schemas.openxmlformats.org/drawingml/2006/picture">
                   <pic:nvPicPr>
-                    <pic:cNvPr id="769803136" name=""/>
+                    <pic:cNvPr id="769803136" name="Graphic 1"/>
                     <pic:cNvPicPr/>
                   </pic:nvPicPr>
                   <pic:blipFill>
                     <a:blip r:embed="rId7">
                       <a:extLst>
-                        <a:ext uri="{96DAC541-7B7A-43D3-8B79-37D633B846F1}">
-                          <asvg:svgBlip xmlns:asvg="http://schemas.microsoft.com/office/drawing/2016/SVG/main" r:embed="rId8"/>
+                        <a:ext uri="{28A0092B-C50C-407E-A947-70E740481C1C}">
+                          <a14:useLocalDpi xmlns:a14="http://schemas.microsoft.com/office/drawing/2010/main" val="0"/>
                         </a:ext>
                       </a:extLst>
                     </a:blip>
@@ -56,7 +56,7 @@
                   <pic:spPr>
                     <a:xfrm>
                       <a:off x="0" y="0"/>
-                      <a:ext cx="7597184" cy="10703409"/>
+                      <a:ext cx="7556500" cy="10702925"/>
                     </a:xfrm>
                     <a:prstGeom prst="rect">
                       <a:avLst/>
@@ -94,10 +94,10 @@
                     <pic:cNvPicPr/>
                   </pic:nvPicPr>
                   <pic:blipFill>
-                    <a:blip r:embed="rId7">
+                    <a:blip r:embed="rId8">
                       <a:extLst>
                         <a:ext uri="{96DAC541-7B7A-43D3-8B79-37D633B846F1}">
-                          <asvg:svgBlip xmlns:asvg="http://schemas.microsoft.com/office/drawing/2016/SVG/main" r:embed="rId8"/>
+                          <asvg:svgBlip xmlns:asvg="http://schemas.microsoft.com/office/drawing/2016/SVG/main" r:embed="rId9"/>
                         </a:ext>
                       </a:extLst>
                     </a:blip>
@@ -148,7 +148,7 @@
                     <pic:cNvPicPr/>
                   </pic:nvPicPr>
                   <pic:blipFill>
-                    <a:blip r:embed="rId9">
+                    <a:blip r:embed="rId10">
                       <a:extLst>
                         <a:ext uri="{28A0092B-C50C-407E-A947-70E740481C1C}">
                           <a14:useLocalDpi xmlns:a14="http://schemas.microsoft.com/office/drawing/2010/main" val="0"/>
@@ -334,17 +334,25 @@
         <w:spacing w:line="360" w:lineRule="auto"/>
         <w:jc w:val="both"/>
         <w:rPr>
-          <w:b/>
-          <w:bCs/>
-          <w:sz w:val="28"/>
-          <w:szCs w:val="28"/>
+          <w:rFonts w:ascii="Times New Roman" w:hAnsi="Times New Roman" w:cs="Times New Roman"/>
+          <w:sz w:val="28"/>
+          <w:szCs w:val="28"/>
+          <w:lang w:val="en-IN"/>
         </w:rPr>
       </w:pPr>
+      <w:r>
+        <w:rPr>
+          <w:rFonts w:ascii="Times New Roman" w:hAnsi="Times New Roman" w:cs="Times New Roman"/>
+          <w:sz w:val="28"/>
+          <w:szCs w:val="28"/>
+          <w:lang w:val="en-IN"/>
+        </w:rPr>
+        <w:t>We also certify that this work has not been submitted, either in part or full, for the award of any other degree elsewhere.</w:t>
+      </w:r>
     </w:p>
     <w:p>
       <w:pPr>
         <w:spacing w:line="360" w:lineRule="auto"/>
-        <w:jc w:val="both"/>
         <w:rPr>
           <w:rFonts w:ascii="Times New Roman" w:hAnsi="Times New Roman" w:cs="Times New Roman"/>
           <w:sz w:val="28"/>
@@ -355,107 +363,86 @@
       <w:r>
         <w:rPr>
           <w:rFonts w:ascii="Times New Roman" w:hAnsi="Times New Roman" w:cs="Times New Roman"/>
-          <w:sz w:val="28"/>
-          <w:szCs w:val="28"/>
-          <w:lang w:val="en-IN"/>
-        </w:rPr>
-        <w:t>We also certify that this work has not been submitted, either in part or full, for the award of any other degree elsewhere.</w:t>
+          <w:b/>
+          <w:bCs/>
+          <w:sz w:val="28"/>
+          <w:szCs w:val="28"/>
+          <w:lang w:val="en-IN"/>
+        </w:rPr>
+        <w:t>Signature of Gunjan Dhaduk :</w:t>
+      </w:r>
+      <w:r>
+        <w:rPr>
+          <w:rFonts w:ascii="Times New Roman" w:hAnsi="Times New Roman" w:cs="Times New Roman"/>
+          <w:sz w:val="28"/>
+          <w:szCs w:val="28"/>
+          <w:lang w:val="en-IN"/>
+        </w:rPr>
+        <w:t xml:space="preserve"> __________</w:t>
+      </w:r>
+      <w:r>
+        <w:rPr>
+          <w:rFonts w:ascii="Times New Roman" w:hAnsi="Times New Roman" w:cs="Times New Roman"/>
+          <w:sz w:val="28"/>
+          <w:szCs w:val="28"/>
+          <w:lang w:val="en-IN"/>
+        </w:rPr>
+        <w:br/>
+      </w:r>
+      <w:r>
+        <w:rPr>
+          <w:rFonts w:ascii="Times New Roman" w:hAnsi="Times New Roman" w:cs="Times New Roman"/>
+          <w:b/>
+          <w:bCs/>
+          <w:sz w:val="28"/>
+          <w:szCs w:val="28"/>
+          <w:lang w:val="en-IN"/>
+        </w:rPr>
+        <w:t xml:space="preserve">Signature of </w:t>
+      </w:r>
+      <w:r>
+        <w:rPr>
+          <w:rFonts w:ascii="Times New Roman" w:hAnsi="Times New Roman" w:cs="Times New Roman"/>
+          <w:b/>
+          <w:bCs/>
+          <w:sz w:val="28"/>
+          <w:szCs w:val="28"/>
+        </w:rPr>
+        <w:t xml:space="preserve">Jisna Saji </w:t>
+      </w:r>
+      <w:r>
+        <w:rPr>
+          <w:rFonts w:ascii="Times New Roman" w:hAnsi="Times New Roman" w:cs="Times New Roman"/>
+          <w:b/>
+          <w:bCs/>
+          <w:sz w:val="28"/>
+          <w:szCs w:val="28"/>
+          <w:lang w:val="en-IN"/>
+        </w:rPr>
+        <w:t>:</w:t>
+      </w:r>
+      <w:r>
+        <w:rPr>
+          <w:rFonts w:ascii="Times New Roman" w:hAnsi="Times New Roman" w:cs="Times New Roman"/>
+          <w:sz w:val="28"/>
+          <w:szCs w:val="28"/>
+          <w:lang w:val="en-IN"/>
+        </w:rPr>
+        <w:t xml:space="preserve"> __________</w:t>
+      </w:r>
+      <w:r>
+        <w:rPr>
+          <w:rFonts w:ascii="Times New Roman" w:hAnsi="Times New Roman" w:cs="Times New Roman"/>
+          <w:sz w:val="28"/>
+          <w:szCs w:val="28"/>
+          <w:lang w:val="en-IN"/>
+        </w:rPr>
+        <w:br/>
       </w:r>
     </w:p>
     <w:p>
       <w:pPr>
         <w:spacing w:line="360" w:lineRule="auto"/>
-        <w:rPr>
-          <w:rFonts w:ascii="Times New Roman" w:hAnsi="Times New Roman" w:cs="Times New Roman"/>
-          <w:sz w:val="28"/>
-          <w:szCs w:val="28"/>
-          <w:lang w:val="en-IN"/>
-        </w:rPr>
-      </w:pPr>
-      <w:r>
-        <w:rPr>
-          <w:rFonts w:ascii="Times New Roman" w:hAnsi="Times New Roman" w:cs="Times New Roman"/>
-          <w:b/>
-          <w:bCs/>
-          <w:sz w:val="28"/>
-          <w:szCs w:val="28"/>
-          <w:lang w:val="en-IN"/>
-        </w:rPr>
-        <w:t>Signature of Gunjan Dhaduk :</w:t>
-      </w:r>
-      <w:r>
-        <w:rPr>
-          <w:rFonts w:ascii="Times New Roman" w:hAnsi="Times New Roman" w:cs="Times New Roman"/>
-          <w:sz w:val="28"/>
-          <w:szCs w:val="28"/>
-          <w:lang w:val="en-IN"/>
-        </w:rPr>
-        <w:t xml:space="preserve"> __________</w:t>
-      </w:r>
-      <w:r>
-        <w:rPr>
-          <w:rFonts w:ascii="Times New Roman" w:hAnsi="Times New Roman" w:cs="Times New Roman"/>
-          <w:sz w:val="28"/>
-          <w:szCs w:val="28"/>
-          <w:lang w:val="en-IN"/>
-        </w:rPr>
-        <w:br/>
-      </w:r>
-      <w:r>
-        <w:rPr>
-          <w:rFonts w:ascii="Times New Roman" w:hAnsi="Times New Roman" w:cs="Times New Roman"/>
-          <w:b/>
-          <w:bCs/>
-          <w:sz w:val="28"/>
-          <w:szCs w:val="28"/>
-          <w:lang w:val="en-IN"/>
-        </w:rPr>
-        <w:t xml:space="preserve">Signature of </w:t>
-      </w:r>
-      <w:r>
-        <w:rPr>
-          <w:rFonts w:ascii="Times New Roman" w:hAnsi="Times New Roman" w:cs="Times New Roman"/>
-          <w:b/>
-          <w:bCs/>
-          <w:sz w:val="28"/>
-          <w:szCs w:val="28"/>
-        </w:rPr>
-        <w:t xml:space="preserve">Jisna Saji </w:t>
-      </w:r>
-      <w:r>
-        <w:rPr>
-          <w:rFonts w:ascii="Times New Roman" w:hAnsi="Times New Roman" w:cs="Times New Roman"/>
-          <w:b/>
-          <w:bCs/>
-          <w:sz w:val="28"/>
-          <w:szCs w:val="28"/>
-          <w:lang w:val="en-IN"/>
-        </w:rPr>
-        <w:t>:</w:t>
-      </w:r>
-      <w:r>
-        <w:rPr>
-          <w:rFonts w:ascii="Times New Roman" w:hAnsi="Times New Roman" w:cs="Times New Roman"/>
-          <w:sz w:val="28"/>
-          <w:szCs w:val="28"/>
-          <w:lang w:val="en-IN"/>
-        </w:rPr>
-        <w:t xml:space="preserve"> __________</w:t>
-      </w:r>
-      <w:r>
-        <w:rPr>
-          <w:rFonts w:ascii="Times New Roman" w:hAnsi="Times New Roman" w:cs="Times New Roman"/>
-          <w:sz w:val="28"/>
-          <w:szCs w:val="28"/>
-          <w:lang w:val="en-IN"/>
-        </w:rPr>
-        <w:br/>
-      </w:r>
-    </w:p>
-    <w:p>
-      <w:pPr>
-        <w:spacing w:line="360" w:lineRule="auto"/>
-        <w:jc w:val="both"/>
         <w:rPr>
           <w:rFonts w:ascii="Times New Roman" w:hAnsi="Times New Roman" w:cs="Times New Roman"/>
           <w:sz w:val="28"/>
@@ -524,6 +511,19 @@
               <w:t>Head</w:t>
             </w:r>
           </w:p>
+          <w:p>
+            <w:pPr>
+              <w:spacing w:line="360" w:lineRule="auto"/>
+              <w:rPr>
+                <w:rFonts w:ascii="Times New Roman" w:hAnsi="Times New Roman" w:cs="Times New Roman"/>
+                <w:b/>
+                <w:bCs/>
+                <w:sz w:val="28"/>
+                <w:szCs w:val="28"/>
+                <w:lang w:val="en-IN"/>
+              </w:rPr>
+            </w:pPr>
+          </w:p>
         </w:tc>
         <w:tc>
           <w:tcPr>
@@ -584,6 +584,19 @@
               </w:rPr>
               <w:t>Guide</w:t>
             </w:r>
+          </w:p>
+          <w:p>
+            <w:pPr>
+              <w:spacing w:line="360" w:lineRule="auto"/>
+              <w:rPr>
+                <w:rFonts w:ascii="Times New Roman" w:hAnsi="Times New Roman" w:cs="Times New Roman"/>
+                <w:b/>
+                <w:bCs/>
+                <w:sz w:val="28"/>
+                <w:szCs w:val="28"/>
+                <w:lang w:val="en-IN"/>
+              </w:rPr>
+            </w:pPr>
           </w:p>
         </w:tc>
       </w:tr>
@@ -2906,8 +2919,8 @@
       </w:pPr>
     </w:p>
     <w:sectPr>
-      <w:headerReference w:type="default" r:id="rId10"/>
-      <w:footerReference w:type="default" r:id="rId11"/>
+      <w:headerReference w:type="default" r:id="rId11"/>
+      <w:footerReference w:type="default" r:id="rId12"/>
       <w:pgSz w:w="11906" w:h="16838"/>
       <w:pgMar w:top="1440" w:right="1440" w:bottom="1440" w:left="1440" w:header="720" w:footer="720" w:gutter="0"/>
       <w:cols w:space="708"/>

</xml_diff>